<commit_message>
docs: update documentation and add dependency-check report
</commit_message>
<xml_diff>
--- a/IT22555380.docx
+++ b/IT22555380.docx
@@ -23,7 +23,7 @@
         <mc:AlternateContent>
           <mc:Choice Requires="wpg">
             <w:drawing>
-              <wp:anchor distT="0" distB="0" distL="114300" distR="114300" simplePos="0" relativeHeight="251659264" behindDoc="0" locked="0" layoutInCell="1" allowOverlap="1" wp14:anchorId="3B0D1812" wp14:editId="22540C5A">
+              <wp:anchor distT="0" distB="0" distL="114300" distR="114300" simplePos="0" relativeHeight="251658240" behindDoc="0" locked="0" layoutInCell="1" allowOverlap="1" wp14:anchorId="3B0D1812" wp14:editId="5F4C13D5">
                 <wp:simplePos x="0" y="0"/>
                 <wp:positionH relativeFrom="page">
                   <wp:align>left</wp:align>
@@ -165,7 +165,7 @@
           </mc:Choice>
           <mc:Fallback>
             <w:pict>
-              <v:group w14:anchorId="3B0D1812" id="Group 756" o:spid="_x0000_s1026" style="position:absolute;left:0;text-align:left;margin-left:0;margin-top:-6.25pt;width:611.4pt;height:64.7pt;z-index:251659264;mso-position-horizontal:left;mso-position-horizontal-relative:page;mso-position-vertical-relative:page;mso-width-relative:margin" coordsize="75465,8216" o:gfxdata="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">
+              <v:group w14:anchorId="3B0D1812" id="Group 756" o:spid="_x0000_s1026" style="position:absolute;left:0;text-align:left;margin-left:0;margin-top:-6.25pt;width:611.4pt;height:64.7pt;z-index:251658240;mso-position-horizontal:left;mso-position-horizontal-relative:page;mso-position-vertical-relative:page;mso-width-relative:margin" coordsize="75465,8216" o:gfxdata="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">
                 <v:shapetype id="_x0000_t75" coordsize="21600,21600" o:spt="75" o:preferrelative="t" path="m@4@5l@4@11@9@11@9@5xe" filled="f" stroked="f">
                   <v:stroke joinstyle="miter"/>
                   <v:formulas>
@@ -267,17 +267,7 @@
           <w:sz w:val="32"/>
           <w:szCs w:val="32"/>
         </w:rPr>
-        <w:t xml:space="preserve">7 - </w:t>
-      </w:r>
-      <w:r>
-        <w:rPr>
-          <w:b/>
-          <w:bCs/>
-          <w:color w:val="215E99" w:themeColor="text2" w:themeTint="BF"/>
-          <w:sz w:val="32"/>
-          <w:szCs w:val="32"/>
-        </w:rPr>
-        <w:t>Vulnerability Detection and Remediation</w:t>
+        <w:t>7 - Vulnerability Detection and Remediation</w:t>
       </w:r>
     </w:p>
     <w:p>
@@ -392,7 +382,7 @@
         <mc:AlternateContent>
           <mc:Choice Requires="wps">
             <w:drawing>
-              <wp:anchor distT="0" distB="0" distL="114300" distR="114300" simplePos="0" relativeHeight="251670528" behindDoc="0" locked="0" layoutInCell="1" allowOverlap="1" wp14:anchorId="1D9F99B5" wp14:editId="2D72A8F5">
+              <wp:anchor distT="0" distB="0" distL="114300" distR="114300" simplePos="0" relativeHeight="251669504" behindDoc="0" locked="0" layoutInCell="1" allowOverlap="1" wp14:anchorId="1D9F99B5" wp14:editId="1A6F796E">
                 <wp:simplePos x="0" y="0"/>
                 <wp:positionH relativeFrom="column">
                   <wp:posOffset>342900</wp:posOffset>
@@ -439,24 +429,14 @@
                             <w:r>
                               <w:t xml:space="preserve">Figure </w:t>
                             </w:r>
-                            <w:r>
-                              <w:fldChar w:fldCharType="begin"/>
-                            </w:r>
-                            <w:r>
-                              <w:instrText xml:space="preserve"> SEQ Figure \* ARABIC </w:instrText>
-                            </w:r>
-                            <w:r>
-                              <w:fldChar w:fldCharType="separate"/>
-                            </w:r>
-                            <w:r>
-                              <w:rPr>
-                                <w:noProof/>
-                              </w:rPr>
-                              <w:t>1</w:t>
-                            </w:r>
-                            <w:r>
-                              <w:fldChar w:fldCharType="end"/>
-                            </w:r>
+                            <w:fldSimple w:instr=" SEQ Figure \* ARABIC ">
+                              <w:r>
+                                <w:rPr>
+                                  <w:noProof/>
+                                </w:rPr>
+                                <w:t>1</w:t>
+                              </w:r>
+                            </w:fldSimple>
                             <w:r>
                               <w:t>:</w:t>
                             </w:r>
@@ -492,7 +472,7 @@
                 <v:stroke joinstyle="miter"/>
                 <v:path gradientshapeok="t" o:connecttype="rect"/>
               </v:shapetype>
-              <v:shape id="Text Box 1" o:spid="_x0000_s1031" type="#_x0000_t202" style="position:absolute;margin-left:27pt;margin-top:273.2pt;width:413.55pt;height:.05pt;z-index:251670528;visibility:visible;mso-wrap-style:square;mso-wrap-distance-left:9pt;mso-wrap-distance-top:0;mso-wrap-distance-right:9pt;mso-wrap-distance-bottom:0;mso-position-horizontal:absolute;mso-position-horizontal-relative:text;mso-position-vertical:absolute;mso-position-vertical-relative:text;v-text-anchor:top" o:gfxdata="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" stroked="f">
+              <v:shape id="Text Box 1" o:spid="_x0000_s1031" type="#_x0000_t202" style="position:absolute;margin-left:27pt;margin-top:273.2pt;width:413.55pt;height:.05pt;z-index:251669504;visibility:visible;mso-wrap-style:square;mso-wrap-distance-left:9pt;mso-wrap-distance-top:0;mso-wrap-distance-right:9pt;mso-wrap-distance-bottom:0;mso-position-horizontal:absolute;mso-position-horizontal-relative:text;mso-position-vertical:absolute;mso-position-vertical-relative:text;v-text-anchor:top" o:gfxdata="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" stroked="f">
                 <v:textbox style="mso-fit-shape-to-text:t" inset="0,0,0,0">
                   <w:txbxContent>
                     <w:p>
@@ -508,24 +488,14 @@
                       <w:r>
                         <w:t xml:space="preserve">Figure </w:t>
                       </w:r>
-                      <w:r>
-                        <w:fldChar w:fldCharType="begin"/>
-                      </w:r>
-                      <w:r>
-                        <w:instrText xml:space="preserve"> SEQ Figure \* ARABIC </w:instrText>
-                      </w:r>
-                      <w:r>
-                        <w:fldChar w:fldCharType="separate"/>
-                      </w:r>
-                      <w:r>
-                        <w:rPr>
-                          <w:noProof/>
-                        </w:rPr>
-                        <w:t>1</w:t>
-                      </w:r>
-                      <w:r>
-                        <w:fldChar w:fldCharType="end"/>
-                      </w:r>
+                      <w:fldSimple w:instr=" SEQ Figure \* ARABIC ">
+                        <w:r>
+                          <w:rPr>
+                            <w:noProof/>
+                          </w:rPr>
+                          <w:t>1</w:t>
+                        </w:r>
+                      </w:fldSimple>
                       <w:r>
                         <w:t>:</w:t>
                       </w:r>
@@ -556,7 +526,7 @@
           <w:noProof/>
         </w:rPr>
         <w:drawing>
-          <wp:anchor distT="0" distB="0" distL="114300" distR="114300" simplePos="0" relativeHeight="251662336" behindDoc="1" locked="0" layoutInCell="1" allowOverlap="1" wp14:anchorId="1A00968F" wp14:editId="0548BE3F">
+          <wp:anchor distT="0" distB="0" distL="114300" distR="114300" simplePos="0" relativeHeight="251661312" behindDoc="1" locked="0" layoutInCell="1" allowOverlap="1" wp14:anchorId="1A00968F" wp14:editId="04A1BBBB">
             <wp:simplePos x="0" y="0"/>
             <wp:positionH relativeFrom="margin">
               <wp:align>center</wp:align>
@@ -694,7 +664,7 @@
         <mc:AlternateContent>
           <mc:Choice Requires="wps">
             <w:drawing>
-              <wp:anchor distT="0" distB="0" distL="114300" distR="114300" simplePos="0" relativeHeight="251672576" behindDoc="0" locked="0" layoutInCell="1" allowOverlap="1" wp14:anchorId="681A3BEB" wp14:editId="1611FCE1">
+              <wp:anchor distT="0" distB="0" distL="114300" distR="114300" simplePos="0" relativeHeight="251671552" behindDoc="0" locked="0" layoutInCell="1" allowOverlap="1" wp14:anchorId="681A3BEB" wp14:editId="41923CDD">
                 <wp:simplePos x="0" y="0"/>
                 <wp:positionH relativeFrom="column">
                   <wp:posOffset>400050</wp:posOffset>
@@ -739,24 +709,14 @@
                             <w:r>
                               <w:t xml:space="preserve">Figure </w:t>
                             </w:r>
-                            <w:r>
-                              <w:fldChar w:fldCharType="begin"/>
-                            </w:r>
-                            <w:r>
-                              <w:instrText xml:space="preserve"> SEQ Figure \* ARABIC </w:instrText>
-                            </w:r>
-                            <w:r>
-                              <w:fldChar w:fldCharType="separate"/>
-                            </w:r>
-                            <w:r>
-                              <w:rPr>
-                                <w:noProof/>
-                              </w:rPr>
-                              <w:t>2</w:t>
-                            </w:r>
-                            <w:r>
-                              <w:fldChar w:fldCharType="end"/>
-                            </w:r>
+                            <w:fldSimple w:instr=" SEQ Figure \* ARABIC ">
+                              <w:r>
+                                <w:rPr>
+                                  <w:noProof/>
+                                </w:rPr>
+                                <w:t>2</w:t>
+                              </w:r>
+                            </w:fldSimple>
                             <w:r>
                               <w:t xml:space="preserve"> : </w:t>
                             </w:r>
@@ -780,7 +740,7 @@
           </mc:Choice>
           <mc:Fallback>
             <w:pict>
-              <v:shape w14:anchorId="681A3BEB" id="_x0000_s1032" type="#_x0000_t202" style="position:absolute;margin-left:31.5pt;margin-top:286.95pt;width:404.25pt;height:.05pt;z-index:251672576;visibility:visible;mso-wrap-style:square;mso-wrap-distance-left:9pt;mso-wrap-distance-top:0;mso-wrap-distance-right:9pt;mso-wrap-distance-bottom:0;mso-position-horizontal:absolute;mso-position-horizontal-relative:text;mso-position-vertical:absolute;mso-position-vertical-relative:text;v-text-anchor:top" o:gfxdata="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" stroked="f">
+              <v:shape w14:anchorId="681A3BEB" id="_x0000_s1032" type="#_x0000_t202" style="position:absolute;margin-left:31.5pt;margin-top:286.95pt;width:404.25pt;height:.05pt;z-index:251671552;visibility:visible;mso-wrap-style:square;mso-wrap-distance-left:9pt;mso-wrap-distance-top:0;mso-wrap-distance-right:9pt;mso-wrap-distance-bottom:0;mso-position-horizontal:absolute;mso-position-horizontal-relative:text;mso-position-vertical:absolute;mso-position-vertical-relative:text;v-text-anchor:top" o:gfxdata="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" stroked="f">
                 <v:textbox style="mso-fit-shape-to-text:t" inset="0,0,0,0">
                   <w:txbxContent>
                     <w:p>
@@ -794,24 +754,14 @@
                       <w:r>
                         <w:t xml:space="preserve">Figure </w:t>
                       </w:r>
-                      <w:r>
-                        <w:fldChar w:fldCharType="begin"/>
-                      </w:r>
-                      <w:r>
-                        <w:instrText xml:space="preserve"> SEQ Figure \* ARABIC </w:instrText>
-                      </w:r>
-                      <w:r>
-                        <w:fldChar w:fldCharType="separate"/>
-                      </w:r>
-                      <w:r>
-                        <w:rPr>
-                          <w:noProof/>
-                        </w:rPr>
-                        <w:t>2</w:t>
-                      </w:r>
-                      <w:r>
-                        <w:fldChar w:fldCharType="end"/>
-                      </w:r>
+                      <w:fldSimple w:instr=" SEQ Figure \* ARABIC ">
+                        <w:r>
+                          <w:rPr>
+                            <w:noProof/>
+                          </w:rPr>
+                          <w:t>2</w:t>
+                        </w:r>
+                      </w:fldSimple>
                       <w:r>
                         <w:t xml:space="preserve"> : </w:t>
                       </w:r>
@@ -832,7 +782,7 @@
           <w:noProof/>
         </w:rPr>
         <w:drawing>
-          <wp:anchor distT="0" distB="0" distL="114300" distR="114300" simplePos="0" relativeHeight="251663360" behindDoc="1" locked="0" layoutInCell="1" allowOverlap="1" wp14:anchorId="0360AF0A" wp14:editId="1AE2AE63">
+          <wp:anchor distT="0" distB="0" distL="114300" distR="114300" simplePos="0" relativeHeight="251662336" behindDoc="1" locked="0" layoutInCell="1" allowOverlap="1" wp14:anchorId="0360AF0A" wp14:editId="4BABB73F">
             <wp:simplePos x="0" y="0"/>
             <wp:positionH relativeFrom="margin">
               <wp:align>center</wp:align>
@@ -930,7 +880,7 @@
         <mc:AlternateContent>
           <mc:Choice Requires="wps">
             <w:drawing>
-              <wp:anchor distT="0" distB="0" distL="114300" distR="114300" simplePos="0" relativeHeight="251674624" behindDoc="1" locked="0" layoutInCell="1" allowOverlap="1" wp14:anchorId="087E5797" wp14:editId="2E531568">
+              <wp:anchor distT="0" distB="0" distL="114300" distR="114300" simplePos="0" relativeHeight="251673600" behindDoc="1" locked="0" layoutInCell="1" allowOverlap="1" wp14:anchorId="087E5797" wp14:editId="2235C434">
                 <wp:simplePos x="0" y="0"/>
                 <wp:positionH relativeFrom="margin">
                   <wp:align>center</wp:align>
@@ -975,24 +925,14 @@
                             <w:r>
                               <w:t xml:space="preserve">Figure </w:t>
                             </w:r>
-                            <w:r>
-                              <w:fldChar w:fldCharType="begin"/>
-                            </w:r>
-                            <w:r>
-                              <w:instrText xml:space="preserve"> SEQ Figure \* ARABIC </w:instrText>
-                            </w:r>
-                            <w:r>
-                              <w:fldChar w:fldCharType="separate"/>
-                            </w:r>
-                            <w:r>
-                              <w:rPr>
-                                <w:noProof/>
-                              </w:rPr>
-                              <w:t>3</w:t>
-                            </w:r>
-                            <w:r>
-                              <w:fldChar w:fldCharType="end"/>
-                            </w:r>
+                            <w:fldSimple w:instr=" SEQ Figure \* ARABIC ">
+                              <w:r>
+                                <w:rPr>
+                                  <w:noProof/>
+                                </w:rPr>
+                                <w:t>3</w:t>
+                              </w:r>
+                            </w:fldSimple>
                             <w:r>
                               <w:t xml:space="preserve"> : </w:t>
                             </w:r>
@@ -1016,7 +956,7 @@
           </mc:Choice>
           <mc:Fallback>
             <w:pict>
-              <v:shape w14:anchorId="087E5797" id="_x0000_s1033" type="#_x0000_t202" style="position:absolute;margin-left:0;margin-top:275.1pt;width:421.5pt;height:.05pt;z-index:-251641856;visibility:visible;mso-wrap-style:square;mso-wrap-distance-left:9pt;mso-wrap-distance-top:0;mso-wrap-distance-right:9pt;mso-wrap-distance-bottom:0;mso-position-horizontal:center;mso-position-horizontal-relative:margin;mso-position-vertical:absolute;mso-position-vertical-relative:text;v-text-anchor:top" o:gfxdata="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" stroked="f">
+              <v:shape w14:anchorId="087E5797" id="_x0000_s1033" type="#_x0000_t202" style="position:absolute;margin-left:0;margin-top:275.1pt;width:421.5pt;height:.05pt;z-index:-251642880;visibility:visible;mso-wrap-style:square;mso-wrap-distance-left:9pt;mso-wrap-distance-top:0;mso-wrap-distance-right:9pt;mso-wrap-distance-bottom:0;mso-position-horizontal:center;mso-position-horizontal-relative:margin;mso-position-vertical:absolute;mso-position-vertical-relative:text;v-text-anchor:top" o:gfxdata="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" stroked="f">
                 <v:textbox style="mso-fit-shape-to-text:t" inset="0,0,0,0">
                   <w:txbxContent>
                     <w:p>
@@ -1030,24 +970,14 @@
                       <w:r>
                         <w:t xml:space="preserve">Figure </w:t>
                       </w:r>
-                      <w:r>
-                        <w:fldChar w:fldCharType="begin"/>
-                      </w:r>
-                      <w:r>
-                        <w:instrText xml:space="preserve"> SEQ Figure \* ARABIC </w:instrText>
-                      </w:r>
-                      <w:r>
-                        <w:fldChar w:fldCharType="separate"/>
-                      </w:r>
-                      <w:r>
-                        <w:rPr>
-                          <w:noProof/>
-                        </w:rPr>
-                        <w:t>3</w:t>
-                      </w:r>
-                      <w:r>
-                        <w:fldChar w:fldCharType="end"/>
-                      </w:r>
+                      <w:fldSimple w:instr=" SEQ Figure \* ARABIC ">
+                        <w:r>
+                          <w:rPr>
+                            <w:noProof/>
+                          </w:rPr>
+                          <w:t>3</w:t>
+                        </w:r>
+                      </w:fldSimple>
                       <w:r>
                         <w:t xml:space="preserve"> : </w:t>
                       </w:r>
@@ -1068,7 +998,7 @@
           <w:noProof/>
         </w:rPr>
         <w:drawing>
-          <wp:anchor distT="0" distB="0" distL="114300" distR="114300" simplePos="0" relativeHeight="251664384" behindDoc="1" locked="0" layoutInCell="1" allowOverlap="1" wp14:anchorId="6E4C7E42" wp14:editId="335B2428">
+          <wp:anchor distT="0" distB="0" distL="114300" distR="114300" simplePos="0" relativeHeight="251663360" behindDoc="1" locked="0" layoutInCell="1" allowOverlap="1" wp14:anchorId="6E4C7E42" wp14:editId="15A1BC36">
             <wp:simplePos x="0" y="0"/>
             <wp:positionH relativeFrom="margin">
               <wp:align>center</wp:align>
@@ -1175,7 +1105,7 @@
         <mc:AlternateContent>
           <mc:Choice Requires="wps">
             <w:drawing>
-              <wp:anchor distT="0" distB="0" distL="114300" distR="114300" simplePos="0" relativeHeight="251676672" behindDoc="0" locked="0" layoutInCell="1" allowOverlap="1" wp14:anchorId="57C8C70F" wp14:editId="4EF427BD">
+              <wp:anchor distT="0" distB="0" distL="114300" distR="114300" simplePos="0" relativeHeight="251675648" behindDoc="0" locked="0" layoutInCell="1" allowOverlap="1" wp14:anchorId="57C8C70F" wp14:editId="03B4B12C">
                 <wp:simplePos x="0" y="0"/>
                 <wp:positionH relativeFrom="column">
                   <wp:posOffset>390525</wp:posOffset>
@@ -1220,24 +1150,14 @@
                             <w:r>
                               <w:t xml:space="preserve">Figure </w:t>
                             </w:r>
-                            <w:r>
-                              <w:fldChar w:fldCharType="begin"/>
-                            </w:r>
-                            <w:r>
-                              <w:instrText xml:space="preserve"> SEQ Figure \* ARABIC </w:instrText>
-                            </w:r>
-                            <w:r>
-                              <w:fldChar w:fldCharType="separate"/>
-                            </w:r>
-                            <w:r>
-                              <w:rPr>
-                                <w:noProof/>
-                              </w:rPr>
-                              <w:t>4</w:t>
-                            </w:r>
-                            <w:r>
-                              <w:fldChar w:fldCharType="end"/>
-                            </w:r>
+                            <w:fldSimple w:instr=" SEQ Figure \* ARABIC ">
+                              <w:r>
+                                <w:rPr>
+                                  <w:noProof/>
+                                </w:rPr>
+                                <w:t>4</w:t>
+                              </w:r>
+                            </w:fldSimple>
                             <w:r>
                               <w:t xml:space="preserve"> : </w:t>
                             </w:r>
@@ -1261,7 +1181,7 @@
           </mc:Choice>
           <mc:Fallback>
             <w:pict>
-              <v:shape w14:anchorId="57C8C70F" id="_x0000_s1034" type="#_x0000_t202" style="position:absolute;margin-left:30.75pt;margin-top:265.95pt;width:406.5pt;height:.05pt;z-index:251676672;visibility:visible;mso-wrap-style:square;mso-wrap-distance-left:9pt;mso-wrap-distance-top:0;mso-wrap-distance-right:9pt;mso-wrap-distance-bottom:0;mso-position-horizontal:absolute;mso-position-horizontal-relative:text;mso-position-vertical:absolute;mso-position-vertical-relative:text;v-text-anchor:top" o:gfxdata="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" stroked="f">
+              <v:shape w14:anchorId="57C8C70F" id="_x0000_s1034" type="#_x0000_t202" style="position:absolute;margin-left:30.75pt;margin-top:265.95pt;width:406.5pt;height:.05pt;z-index:251675648;visibility:visible;mso-wrap-style:square;mso-wrap-distance-left:9pt;mso-wrap-distance-top:0;mso-wrap-distance-right:9pt;mso-wrap-distance-bottom:0;mso-position-horizontal:absolute;mso-position-horizontal-relative:text;mso-position-vertical:absolute;mso-position-vertical-relative:text;v-text-anchor:top" o:gfxdata="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" stroked="f">
                 <v:textbox style="mso-fit-shape-to-text:t" inset="0,0,0,0">
                   <w:txbxContent>
                     <w:p>
@@ -1275,24 +1195,14 @@
                       <w:r>
                         <w:t xml:space="preserve">Figure </w:t>
                       </w:r>
-                      <w:r>
-                        <w:fldChar w:fldCharType="begin"/>
-                      </w:r>
-                      <w:r>
-                        <w:instrText xml:space="preserve"> SEQ Figure \* ARABIC </w:instrText>
-                      </w:r>
-                      <w:r>
-                        <w:fldChar w:fldCharType="separate"/>
-                      </w:r>
-                      <w:r>
-                        <w:rPr>
-                          <w:noProof/>
-                        </w:rPr>
-                        <w:t>4</w:t>
-                      </w:r>
-                      <w:r>
-                        <w:fldChar w:fldCharType="end"/>
-                      </w:r>
+                      <w:fldSimple w:instr=" SEQ Figure \* ARABIC ">
+                        <w:r>
+                          <w:rPr>
+                            <w:noProof/>
+                          </w:rPr>
+                          <w:t>4</w:t>
+                        </w:r>
+                      </w:fldSimple>
                       <w:r>
                         <w:t xml:space="preserve"> : </w:t>
                       </w:r>
@@ -1313,7 +1223,7 @@
           <w:noProof/>
         </w:rPr>
         <w:drawing>
-          <wp:anchor distT="0" distB="0" distL="114300" distR="114300" simplePos="0" relativeHeight="251665408" behindDoc="1" locked="0" layoutInCell="1" allowOverlap="1" wp14:anchorId="6F56D71E" wp14:editId="1DD68EEB">
+          <wp:anchor distT="0" distB="0" distL="114300" distR="114300" simplePos="0" relativeHeight="251664384" behindDoc="1" locked="0" layoutInCell="1" allowOverlap="1" wp14:anchorId="6F56D71E" wp14:editId="78BE32AA">
             <wp:simplePos x="0" y="0"/>
             <wp:positionH relativeFrom="margin">
               <wp:align>center</wp:align>
@@ -1426,7 +1336,7 @@
         <mc:AlternateContent>
           <mc:Choice Requires="wps">
             <w:drawing>
-              <wp:anchor distT="0" distB="0" distL="114300" distR="114300" simplePos="0" relativeHeight="251678720" behindDoc="0" locked="0" layoutInCell="1" allowOverlap="1" wp14:anchorId="6C25E01E" wp14:editId="483CDDE7">
+              <wp:anchor distT="0" distB="0" distL="114300" distR="114300" simplePos="0" relativeHeight="251677696" behindDoc="0" locked="0" layoutInCell="1" allowOverlap="1" wp14:anchorId="6C25E01E" wp14:editId="45FD93E4">
                 <wp:simplePos x="0" y="0"/>
                 <wp:positionH relativeFrom="column">
                   <wp:posOffset>390525</wp:posOffset>
@@ -1471,24 +1381,14 @@
                             <w:r>
                               <w:t xml:space="preserve">Figure </w:t>
                             </w:r>
-                            <w:r>
-                              <w:fldChar w:fldCharType="begin"/>
-                            </w:r>
-                            <w:r>
-                              <w:instrText xml:space="preserve"> SEQ Figure \* ARABIC </w:instrText>
-                            </w:r>
-                            <w:r>
-                              <w:fldChar w:fldCharType="separate"/>
-                            </w:r>
-                            <w:r>
-                              <w:rPr>
-                                <w:noProof/>
-                              </w:rPr>
-                              <w:t>5</w:t>
-                            </w:r>
-                            <w:r>
-                              <w:fldChar w:fldCharType="end"/>
-                            </w:r>
+                            <w:fldSimple w:instr=" SEQ Figure \* ARABIC ">
+                              <w:r>
+                                <w:rPr>
+                                  <w:noProof/>
+                                </w:rPr>
+                                <w:t>5</w:t>
+                              </w:r>
+                            </w:fldSimple>
                             <w:r>
                               <w:t xml:space="preserve">: </w:t>
                             </w:r>
@@ -1512,7 +1412,7 @@
           </mc:Choice>
           <mc:Fallback>
             <w:pict>
-              <v:shape w14:anchorId="6C25E01E" id="_x0000_s1035" type="#_x0000_t202" style="position:absolute;margin-left:30.75pt;margin-top:253.25pt;width:411.75pt;height:.05pt;z-index:251678720;visibility:visible;mso-wrap-style:square;mso-wrap-distance-left:9pt;mso-wrap-distance-top:0;mso-wrap-distance-right:9pt;mso-wrap-distance-bottom:0;mso-position-horizontal:absolute;mso-position-horizontal-relative:text;mso-position-vertical:absolute;mso-position-vertical-relative:text;v-text-anchor:top" o:gfxdata="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" stroked="f">
+              <v:shape w14:anchorId="6C25E01E" id="_x0000_s1035" type="#_x0000_t202" style="position:absolute;margin-left:30.75pt;margin-top:253.25pt;width:411.75pt;height:.05pt;z-index:251677696;visibility:visible;mso-wrap-style:square;mso-wrap-distance-left:9pt;mso-wrap-distance-top:0;mso-wrap-distance-right:9pt;mso-wrap-distance-bottom:0;mso-position-horizontal:absolute;mso-position-horizontal-relative:text;mso-position-vertical:absolute;mso-position-vertical-relative:text;v-text-anchor:top" o:gfxdata="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" stroked="f">
                 <v:textbox style="mso-fit-shape-to-text:t" inset="0,0,0,0">
                   <w:txbxContent>
                     <w:p>
@@ -1526,24 +1426,14 @@
                       <w:r>
                         <w:t xml:space="preserve">Figure </w:t>
                       </w:r>
-                      <w:r>
-                        <w:fldChar w:fldCharType="begin"/>
-                      </w:r>
-                      <w:r>
-                        <w:instrText xml:space="preserve"> SEQ Figure \* ARABIC </w:instrText>
-                      </w:r>
-                      <w:r>
-                        <w:fldChar w:fldCharType="separate"/>
-                      </w:r>
-                      <w:r>
-                        <w:rPr>
-                          <w:noProof/>
-                        </w:rPr>
-                        <w:t>5</w:t>
-                      </w:r>
-                      <w:r>
-                        <w:fldChar w:fldCharType="end"/>
-                      </w:r>
+                      <w:fldSimple w:instr=" SEQ Figure \* ARABIC ">
+                        <w:r>
+                          <w:rPr>
+                            <w:noProof/>
+                          </w:rPr>
+                          <w:t>5</w:t>
+                        </w:r>
+                      </w:fldSimple>
                       <w:r>
                         <w:t xml:space="preserve">: </w:t>
                       </w:r>
@@ -1563,7 +1453,7 @@
           <w:noProof/>
         </w:rPr>
         <w:drawing>
-          <wp:anchor distT="0" distB="0" distL="114300" distR="114300" simplePos="0" relativeHeight="251666432" behindDoc="1" locked="0" layoutInCell="1" allowOverlap="1" wp14:anchorId="753ADA26" wp14:editId="1A410D5C">
+          <wp:anchor distT="0" distB="0" distL="114300" distR="114300" simplePos="0" relativeHeight="251665408" behindDoc="1" locked="0" layoutInCell="1" allowOverlap="1" wp14:anchorId="753ADA26" wp14:editId="33AA95CD">
             <wp:simplePos x="0" y="0"/>
             <wp:positionH relativeFrom="margin">
               <wp:align>center</wp:align>
@@ -1664,7 +1554,7 @@
         <mc:AlternateContent>
           <mc:Choice Requires="wps">
             <w:drawing>
-              <wp:anchor distT="0" distB="0" distL="114300" distR="114300" simplePos="0" relativeHeight="251680768" behindDoc="0" locked="0" layoutInCell="1" allowOverlap="1" wp14:anchorId="05826C96" wp14:editId="1687158A">
+              <wp:anchor distT="0" distB="0" distL="114300" distR="114300" simplePos="0" relativeHeight="251679744" behindDoc="0" locked="0" layoutInCell="1" allowOverlap="1" wp14:anchorId="05826C96" wp14:editId="2C1F606E">
                 <wp:simplePos x="0" y="0"/>
                 <wp:positionH relativeFrom="column">
                   <wp:posOffset>390525</wp:posOffset>
@@ -1709,24 +1599,14 @@
                             <w:r>
                               <w:t xml:space="preserve">Figure </w:t>
                             </w:r>
-                            <w:r>
-                              <w:fldChar w:fldCharType="begin"/>
-                            </w:r>
-                            <w:r>
-                              <w:instrText xml:space="preserve"> SEQ Figure \* ARABIC </w:instrText>
-                            </w:r>
-                            <w:r>
-                              <w:fldChar w:fldCharType="separate"/>
-                            </w:r>
-                            <w:r>
-                              <w:rPr>
-                                <w:noProof/>
-                              </w:rPr>
-                              <w:t>6</w:t>
-                            </w:r>
-                            <w:r>
-                              <w:fldChar w:fldCharType="end"/>
-                            </w:r>
+                            <w:fldSimple w:instr=" SEQ Figure \* ARABIC ">
+                              <w:r>
+                                <w:rPr>
+                                  <w:noProof/>
+                                </w:rPr>
+                                <w:t>6</w:t>
+                              </w:r>
+                            </w:fldSimple>
                             <w:r>
                               <w:t xml:space="preserve"> : </w:t>
                             </w:r>
@@ -1750,7 +1630,7 @@
           </mc:Choice>
           <mc:Fallback>
             <w:pict>
-              <v:shape w14:anchorId="05826C96" id="_x0000_s1036" type="#_x0000_t202" style="position:absolute;margin-left:30.75pt;margin-top:261.65pt;width:390pt;height:.05pt;z-index:251680768;visibility:visible;mso-wrap-style:square;mso-wrap-distance-left:9pt;mso-wrap-distance-top:0;mso-wrap-distance-right:9pt;mso-wrap-distance-bottom:0;mso-position-horizontal:absolute;mso-position-horizontal-relative:text;mso-position-vertical:absolute;mso-position-vertical-relative:text;v-text-anchor:top" o:gfxdata="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" stroked="f">
+              <v:shape w14:anchorId="05826C96" id="_x0000_s1036" type="#_x0000_t202" style="position:absolute;margin-left:30.75pt;margin-top:261.65pt;width:390pt;height:.05pt;z-index:251679744;visibility:visible;mso-wrap-style:square;mso-wrap-distance-left:9pt;mso-wrap-distance-top:0;mso-wrap-distance-right:9pt;mso-wrap-distance-bottom:0;mso-position-horizontal:absolute;mso-position-horizontal-relative:text;mso-position-vertical:absolute;mso-position-vertical-relative:text;v-text-anchor:top" o:gfxdata="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" stroked="f">
                 <v:textbox style="mso-fit-shape-to-text:t" inset="0,0,0,0">
                   <w:txbxContent>
                     <w:p>
@@ -1764,24 +1644,14 @@
                       <w:r>
                         <w:t xml:space="preserve">Figure </w:t>
                       </w:r>
-                      <w:r>
-                        <w:fldChar w:fldCharType="begin"/>
-                      </w:r>
-                      <w:r>
-                        <w:instrText xml:space="preserve"> SEQ Figure \* ARABIC </w:instrText>
-                      </w:r>
-                      <w:r>
-                        <w:fldChar w:fldCharType="separate"/>
-                      </w:r>
-                      <w:r>
-                        <w:rPr>
-                          <w:noProof/>
-                        </w:rPr>
-                        <w:t>6</w:t>
-                      </w:r>
-                      <w:r>
-                        <w:fldChar w:fldCharType="end"/>
-                      </w:r>
+                      <w:fldSimple w:instr=" SEQ Figure \* ARABIC ">
+                        <w:r>
+                          <w:rPr>
+                            <w:noProof/>
+                          </w:rPr>
+                          <w:t>6</w:t>
+                        </w:r>
+                      </w:fldSimple>
                       <w:r>
                         <w:t xml:space="preserve"> : </w:t>
                       </w:r>
@@ -1802,7 +1672,7 @@
           <w:noProof/>
         </w:rPr>
         <w:drawing>
-          <wp:anchor distT="0" distB="0" distL="114300" distR="114300" simplePos="0" relativeHeight="251667456" behindDoc="1" locked="0" layoutInCell="1" allowOverlap="1" wp14:anchorId="21DAF9CB" wp14:editId="0E4F9367">
+          <wp:anchor distT="0" distB="0" distL="114300" distR="114300" simplePos="0" relativeHeight="251666432" behindDoc="1" locked="0" layoutInCell="1" allowOverlap="1" wp14:anchorId="21DAF9CB" wp14:editId="32419EA2">
             <wp:simplePos x="0" y="0"/>
             <wp:positionH relativeFrom="column">
               <wp:posOffset>390525</wp:posOffset>
@@ -1955,20 +1825,222 @@
           <w:noProof/>
         </w:rPr>
         <mc:AlternateContent>
+          <mc:Choice Requires="wpg">
+            <w:drawing>
+              <wp:anchor distT="0" distB="0" distL="114300" distR="114300" simplePos="0" relativeHeight="251682816" behindDoc="0" locked="0" layoutInCell="1" allowOverlap="1" wp14:anchorId="4A2670C0" wp14:editId="76D30258">
+                <wp:simplePos x="0" y="0"/>
+                <wp:positionH relativeFrom="page">
+                  <wp:posOffset>914400</wp:posOffset>
+                </wp:positionH>
+                <wp:positionV relativeFrom="page">
+                  <wp:posOffset>6153150</wp:posOffset>
+                </wp:positionV>
+                <wp:extent cx="5124450" cy="3333750"/>
+                <wp:effectExtent l="0" t="0" r="0" b="0"/>
+                <wp:wrapNone/>
+                <wp:docPr id="401172227" name="Group 10"/>
+                <wp:cNvGraphicFramePr/>
+                <a:graphic xmlns:a="http://schemas.openxmlformats.org/drawingml/2006/main">
+                  <a:graphicData uri="http://schemas.microsoft.com/office/word/2010/wordprocessingGroup">
+                    <wpg:wgp>
+                      <wpg:cNvGrpSpPr/>
+                      <wpg:grpSpPr>
+                        <a:xfrm>
+                          <a:off x="0" y="0"/>
+                          <a:ext cx="5124450" cy="3333750"/>
+                          <a:chOff x="0" y="0"/>
+                          <a:chExt cx="5124450" cy="3333750"/>
+                        </a:xfrm>
+                      </wpg:grpSpPr>
+                      <pic:pic xmlns:pic="http://schemas.openxmlformats.org/drawingml/2006/picture">
+                        <pic:nvPicPr>
+                          <pic:cNvPr id="614687740" name="Picture 9"/>
+                          <pic:cNvPicPr>
+                            <a:picLocks noChangeAspect="1"/>
+                          </pic:cNvPicPr>
+                        </pic:nvPicPr>
+                        <pic:blipFill>
+                          <a:blip r:embed="rId16" cstate="print">
+                            <a:extLst>
+                              <a:ext uri="{28A0092B-C50C-407E-A947-70E740481C1C}">
+                                <a14:useLocalDpi xmlns:a14="http://schemas.microsoft.com/office/drawing/2010/main" val="0"/>
+                              </a:ext>
+                            </a:extLst>
+                          </a:blip>
+                          <a:srcRect/>
+                          <a:stretch>
+                            <a:fillRect/>
+                          </a:stretch>
+                        </pic:blipFill>
+                        <pic:spPr bwMode="auto">
+                          <a:xfrm>
+                            <a:off x="0" y="0"/>
+                            <a:ext cx="5124450" cy="3070225"/>
+                          </a:xfrm>
+                          <a:prstGeom prst="rect">
+                            <a:avLst/>
+                          </a:prstGeom>
+                          <a:noFill/>
+                          <a:ln>
+                            <a:noFill/>
+                          </a:ln>
+                        </pic:spPr>
+                      </pic:pic>
+                      <wps:wsp>
+                        <wps:cNvPr id="2002987621" name="Text Box 1"/>
+                        <wps:cNvSpPr txBox="1"/>
+                        <wps:spPr>
+                          <a:xfrm>
+                            <a:off x="0" y="3067050"/>
+                            <a:ext cx="5124450" cy="266700"/>
+                          </a:xfrm>
+                          <a:prstGeom prst="rect">
+                            <a:avLst/>
+                          </a:prstGeom>
+                          <a:solidFill>
+                            <a:prstClr val="white"/>
+                          </a:solidFill>
+                          <a:ln>
+                            <a:noFill/>
+                          </a:ln>
+                        </wps:spPr>
+                        <wps:txbx>
+                          <w:txbxContent>
+                            <w:p>
+                              <w:pPr>
+                                <w:pStyle w:val="Caption"/>
+                                <w:jc w:val="center"/>
+                                <w:rPr>
+                                  <w:noProof/>
+                                </w:rPr>
+                              </w:pPr>
+                              <w:r>
+                                <w:t xml:space="preserve">Figure </w:t>
+                              </w:r>
+                              <w:fldSimple w:instr=" SEQ Figure \* ARABIC ">
+                                <w:r>
+                                  <w:rPr>
+                                    <w:noProof/>
+                                  </w:rPr>
+                                  <w:t>7</w:t>
+                                </w:r>
+                              </w:fldSimple>
+                              <w:r>
+                                <w:t xml:space="preserve">: </w:t>
+                              </w:r>
+                              <w:r>
+                                <w:t xml:space="preserve">Final </w:t>
+                              </w:r>
+                              <w:proofErr w:type="spellStart"/>
+                              <w:r>
+                                <w:t>QApug</w:t>
+                              </w:r>
+                              <w:proofErr w:type="spellEnd"/>
+                              <w:r>
+                                <w:t xml:space="preserve"> Analysis</w:t>
+                              </w:r>
+                            </w:p>
+                          </w:txbxContent>
+                        </wps:txbx>
+                        <wps:bodyPr rot="0" spcFirstLastPara="0" vertOverflow="overflow" horzOverflow="overflow" vert="horz" wrap="square" lIns="0" tIns="0" rIns="0" bIns="0" numCol="1" spcCol="0" rtlCol="0" fromWordArt="0" anchor="t" anchorCtr="0" forceAA="0" compatLnSpc="1">
+                          <a:prstTxWarp prst="textNoShape">
+                            <a:avLst/>
+                          </a:prstTxWarp>
+                          <a:spAutoFit/>
+                        </wps:bodyPr>
+                      </wps:wsp>
+                    </wpg:wgp>
+                  </a:graphicData>
+                </a:graphic>
+              </wp:anchor>
+            </w:drawing>
+          </mc:Choice>
+          <mc:Fallback>
+            <w:pict>
+              <v:group w14:anchorId="4A2670C0" id="Group 10" o:spid="_x0000_s1037" style="position:absolute;margin-left:1in;margin-top:484.5pt;width:403.5pt;height:262.5pt;z-index:251682816;mso-position-horizontal-relative:page;mso-position-vertical-relative:page" coordsize="51244,33337" o:gfxdata="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">
+                <v:shape id="Picture 9" o:spid="_x0000_s1038" type="#_x0000_t75" style="position:absolute;width:51244;height:30702;visibility:visible;mso-wrap-style:square" o:gfxdata="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">
+                  <v:imagedata r:id="rId17" o:title=""/>
+                </v:shape>
+                <v:shape id="_x0000_s1039" type="#_x0000_t202" style="position:absolute;top:30670;width:51244;height:2667;visibility:visible;mso-wrap-style:square;v-text-anchor:top" o:gfxdata="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" stroked="f">
+                  <v:textbox style="mso-fit-shape-to-text:t" inset="0,0,0,0">
+                    <w:txbxContent>
+                      <w:p>
+                        <w:pPr>
+                          <w:pStyle w:val="Caption"/>
+                          <w:jc w:val="center"/>
+                          <w:rPr>
+                            <w:noProof/>
+                          </w:rPr>
+                        </w:pPr>
+                        <w:r>
+                          <w:t xml:space="preserve">Figure </w:t>
+                        </w:r>
+                        <w:fldSimple w:instr=" SEQ Figure \* ARABIC ">
+                          <w:r>
+                            <w:rPr>
+                              <w:noProof/>
+                            </w:rPr>
+                            <w:t>7</w:t>
+                          </w:r>
+                        </w:fldSimple>
+                        <w:r>
+                          <w:t xml:space="preserve">: </w:t>
+                        </w:r>
+                        <w:r>
+                          <w:t xml:space="preserve">Final </w:t>
+                        </w:r>
+                        <w:proofErr w:type="spellStart"/>
+                        <w:r>
+                          <w:t>QApug</w:t>
+                        </w:r>
+                        <w:proofErr w:type="spellEnd"/>
+                        <w:r>
+                          <w:t xml:space="preserve"> Analysis</w:t>
+                        </w:r>
+                      </w:p>
+                    </w:txbxContent>
+                  </v:textbox>
+                </v:shape>
+                <w10:wrap anchorx="page" anchory="page"/>
+              </v:group>
+            </w:pict>
+          </mc:Fallback>
+        </mc:AlternateContent>
+      </w:r>
+    </w:p>
+    <w:p>
+      <w:r>
+        <w:br w:type="page"/>
+      </w:r>
+    </w:p>
+    <w:p>
+      <w:r>
+        <w:rPr>
+          <w:noProof/>
+        </w:rPr>
+        <w:lastRenderedPageBreak/>
+        <mc:AlternateContent>
           <mc:Choice Requires="wps">
             <w:drawing>
-              <wp:anchor distT="0" distB="0" distL="114300" distR="114300" simplePos="0" relativeHeight="251682816" behindDoc="0" locked="0" layoutInCell="1" allowOverlap="1" wp14:anchorId="40C4D91F" wp14:editId="7444A11E">
+              <wp:anchor distT="0" distB="0" distL="114300" distR="114300" simplePos="0" relativeHeight="251686912" behindDoc="1" locked="0" layoutInCell="1" allowOverlap="1" wp14:anchorId="2750D96D" wp14:editId="18DDBCB1">
                 <wp:simplePos x="0" y="0"/>
                 <wp:positionH relativeFrom="column">
-                  <wp:posOffset>485775</wp:posOffset>
+                  <wp:posOffset>66675</wp:posOffset>
                 </wp:positionH>
                 <wp:positionV relativeFrom="paragraph">
-                  <wp:posOffset>3145790</wp:posOffset>
+                  <wp:posOffset>3694430</wp:posOffset>
                 </wp:positionV>
-                <wp:extent cx="5124450" cy="635"/>
+                <wp:extent cx="5926455" cy="635"/>
                 <wp:effectExtent l="0" t="0" r="0" b="0"/>
-                <wp:wrapNone/>
-                <wp:docPr id="762021703" name="Text Box 1"/>
+                <wp:wrapTight wrapText="bothSides">
+                  <wp:wrapPolygon edited="0">
+                    <wp:start x="0" y="0"/>
+                    <wp:lineTo x="0" y="21600"/>
+                    <wp:lineTo x="21600" y="21600"/>
+                    <wp:lineTo x="21600" y="0"/>
+                  </wp:wrapPolygon>
+                </wp:wrapTight>
+                <wp:docPr id="1924628731" name="Text Box 1"/>
                 <wp:cNvGraphicFramePr/>
                 <a:graphic xmlns:a="http://schemas.openxmlformats.org/drawingml/2006/main">
                   <a:graphicData uri="http://schemas.microsoft.com/office/word/2010/wordprocessingShape">
@@ -1977,7 +2049,7 @@
                       <wps:spPr>
                         <a:xfrm>
                           <a:off x="0" y="0"/>
-                          <a:ext cx="5124450" cy="635"/>
+                          <a:ext cx="5926455" cy="635"/>
                         </a:xfrm>
                         <a:prstGeom prst="rect">
                           <a:avLst/>
@@ -2002,37 +2074,19 @@
                             <w:r>
                               <w:t xml:space="preserve">Figure </w:t>
                             </w:r>
-                            <w:r>
-                              <w:fldChar w:fldCharType="begin"/>
-                            </w:r>
-                            <w:r>
-                              <w:instrText xml:space="preserve"> SEQ Figure \* ARABIC </w:instrText>
-                            </w:r>
-                            <w:r>
-                              <w:fldChar w:fldCharType="separate"/>
-                            </w:r>
-                            <w:r>
-                              <w:rPr>
-                                <w:noProof/>
-                              </w:rPr>
-                              <w:t>7</w:t>
-                            </w:r>
-                            <w:r>
-                              <w:fldChar w:fldCharType="end"/>
-                            </w:r>
+                            <w:fldSimple w:instr=" SEQ Figure \* ARABIC ">
+                              <w:r>
+                                <w:rPr>
+                                  <w:noProof/>
+                                </w:rPr>
+                                <w:t>8</w:t>
+                              </w:r>
+                            </w:fldSimple>
                             <w:r>
                               <w:t xml:space="preserve">: </w:t>
                             </w:r>
                             <w:r>
-                              <w:t xml:space="preserve">Final </w:t>
-                            </w:r>
-                            <w:proofErr w:type="spellStart"/>
-                            <w:r>
-                              <w:t>QApug</w:t>
-                            </w:r>
-                            <w:proofErr w:type="spellEnd"/>
-                            <w:r>
-                              <w:t xml:space="preserve"> Analysis</w:t>
+                              <w:t>OWASP Dependency-Check vulnerability scan summary showing 3 vulnerable dependencies and 8 identified vulnerabilities.</w:t>
                             </w:r>
                           </w:p>
                         </w:txbxContent>
@@ -2051,7 +2105,7 @@
           </mc:Choice>
           <mc:Fallback>
             <w:pict>
-              <v:shape w14:anchorId="40C4D91F" id="_x0000_s1037" type="#_x0000_t202" style="position:absolute;margin-left:38.25pt;margin-top:247.7pt;width:403.5pt;height:.05pt;z-index:251682816;visibility:visible;mso-wrap-style:square;mso-wrap-distance-left:9pt;mso-wrap-distance-top:0;mso-wrap-distance-right:9pt;mso-wrap-distance-bottom:0;mso-position-horizontal:absolute;mso-position-horizontal-relative:text;mso-position-vertical:absolute;mso-position-vertical-relative:text;v-text-anchor:top" o:gfxdata="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" stroked="f">
+              <v:shape w14:anchorId="2750D96D" id="_x0000_s1040" type="#_x0000_t202" style="position:absolute;margin-left:5.25pt;margin-top:290.9pt;width:466.65pt;height:.05pt;z-index:-251629568;visibility:visible;mso-wrap-style:square;mso-wrap-distance-left:9pt;mso-wrap-distance-top:0;mso-wrap-distance-right:9pt;mso-wrap-distance-bottom:0;mso-position-horizontal:absolute;mso-position-horizontal-relative:text;mso-position-vertical:absolute;mso-position-vertical-relative:text;v-text-anchor:top" o:gfxdata="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" stroked="f">
                 <v:textbox style="mso-fit-shape-to-text:t" inset="0,0,0,0">
                   <w:txbxContent>
                     <w:p>
@@ -2065,41 +2119,24 @@
                       <w:r>
                         <w:t xml:space="preserve">Figure </w:t>
                       </w:r>
-                      <w:r>
-                        <w:fldChar w:fldCharType="begin"/>
-                      </w:r>
-                      <w:r>
-                        <w:instrText xml:space="preserve"> SEQ Figure \* ARABIC </w:instrText>
-                      </w:r>
-                      <w:r>
-                        <w:fldChar w:fldCharType="separate"/>
-                      </w:r>
-                      <w:r>
-                        <w:rPr>
-                          <w:noProof/>
-                        </w:rPr>
-                        <w:t>7</w:t>
-                      </w:r>
-                      <w:r>
-                        <w:fldChar w:fldCharType="end"/>
-                      </w:r>
+                      <w:fldSimple w:instr=" SEQ Figure \* ARABIC ">
+                        <w:r>
+                          <w:rPr>
+                            <w:noProof/>
+                          </w:rPr>
+                          <w:t>8</w:t>
+                        </w:r>
+                      </w:fldSimple>
                       <w:r>
                         <w:t xml:space="preserve">: </w:t>
                       </w:r>
                       <w:r>
-                        <w:t xml:space="preserve">Final </w:t>
-                      </w:r>
-                      <w:proofErr w:type="spellStart"/>
-                      <w:r>
-                        <w:t>QApug</w:t>
-                      </w:r>
-                      <w:proofErr w:type="spellEnd"/>
-                      <w:r>
-                        <w:t xml:space="preserve"> Analysis</w:t>
+                        <w:t>OWASP Dependency-Check vulnerability scan summary showing 3 vulnerable dependencies and 8 identified vulnerabilities.</w:t>
                       </w:r>
                     </w:p>
                   </w:txbxContent>
                 </v:textbox>
+                <w10:wrap type="tight"/>
               </v:shape>
             </w:pict>
           </mc:Fallback>
@@ -2110,26 +2147,33 @@
           <w:noProof/>
         </w:rPr>
         <w:drawing>
-          <wp:anchor distT="0" distB="0" distL="114300" distR="114300" simplePos="0" relativeHeight="251668480" behindDoc="1" locked="0" layoutInCell="1" allowOverlap="1" wp14:anchorId="5F8D7FC8" wp14:editId="0990AD28">
+          <wp:anchor distT="0" distB="0" distL="114300" distR="114300" simplePos="0" relativeHeight="251684864" behindDoc="1" locked="0" layoutInCell="1" allowOverlap="1" wp14:anchorId="4693E3EC" wp14:editId="0D9CA27A">
             <wp:simplePos x="0" y="0"/>
-            <wp:positionH relativeFrom="margin">
-              <wp:align>center</wp:align>
+            <wp:positionH relativeFrom="column">
+              <wp:posOffset>76200</wp:posOffset>
             </wp:positionH>
-            <wp:positionV relativeFrom="page">
-              <wp:posOffset>6185535</wp:posOffset>
+            <wp:positionV relativeFrom="paragraph">
+              <wp:posOffset>366395</wp:posOffset>
             </wp:positionV>
-            <wp:extent cx="5124450" cy="3070225"/>
-            <wp:effectExtent l="0" t="0" r="0" b="0"/>
+            <wp:extent cx="5926455" cy="3300095"/>
+            <wp:effectExtent l="152400" t="152400" r="360045" b="357505"/>
             <wp:wrapTight wrapText="bothSides">
               <wp:wrapPolygon edited="0">
-                <wp:start x="0" y="0"/>
-                <wp:lineTo x="0" y="21444"/>
-                <wp:lineTo x="21520" y="21444"/>
-                <wp:lineTo x="21520" y="0"/>
-                <wp:lineTo x="0" y="0"/>
+                <wp:start x="278" y="-997"/>
+                <wp:lineTo x="-555" y="-748"/>
+                <wp:lineTo x="-555" y="22070"/>
+                <wp:lineTo x="-69" y="23192"/>
+                <wp:lineTo x="694" y="23815"/>
+                <wp:lineTo x="21593" y="23815"/>
+                <wp:lineTo x="22357" y="23192"/>
+                <wp:lineTo x="22843" y="21322"/>
+                <wp:lineTo x="22843" y="1247"/>
+                <wp:lineTo x="22010" y="-623"/>
+                <wp:lineTo x="21940" y="-997"/>
+                <wp:lineTo x="278" y="-997"/>
               </wp:wrapPolygon>
             </wp:wrapTight>
-            <wp:docPr id="1205255478" name="Picture 9"/>
+            <wp:docPr id="1417143244" name="Picture 11"/>
             <wp:cNvGraphicFramePr>
               <a:graphicFrameLocks xmlns:a="http://schemas.openxmlformats.org/drawingml/2006/main" noChangeAspect="1"/>
             </wp:cNvGraphicFramePr>
@@ -2137,13 +2181,13 @@
               <a:graphicData uri="http://schemas.openxmlformats.org/drawingml/2006/picture">
                 <pic:pic xmlns:pic="http://schemas.openxmlformats.org/drawingml/2006/picture">
                   <pic:nvPicPr>
-                    <pic:cNvPr id="0" name="Picture 8"/>
+                    <pic:cNvPr id="0" name="Picture 2"/>
                     <pic:cNvPicPr>
                       <a:picLocks noChangeAspect="1" noChangeArrowheads="1"/>
                     </pic:cNvPicPr>
                   </pic:nvPicPr>
                   <pic:blipFill>
-                    <a:blip r:embed="rId16" cstate="print">
+                    <a:blip r:embed="rId18" cstate="print">
                       <a:extLst>
                         <a:ext uri="{28A0092B-C50C-407E-A947-70E740481C1C}">
                           <a14:useLocalDpi xmlns:a14="http://schemas.microsoft.com/office/drawing/2010/main" val="0"/>
@@ -2158,15 +2202,21 @@
                   <pic:spPr bwMode="auto">
                     <a:xfrm>
                       <a:off x="0" y="0"/>
-                      <a:ext cx="5124450" cy="3070225"/>
+                      <a:ext cx="5926455" cy="3300095"/>
                     </a:xfrm>
                     <a:prstGeom prst="rect">
                       <a:avLst/>
                     </a:prstGeom>
-                    <a:noFill/>
                     <a:ln>
                       <a:noFill/>
                     </a:ln>
+                    <a:effectLst>
+                      <a:outerShdw blurRad="292100" dist="139700" dir="2700000" algn="tl" rotWithShape="0">
+                        <a:srgbClr val="333333">
+                          <a:alpha val="65000"/>
+                        </a:srgbClr>
+                      </a:outerShdw>
+                    </a:effectLst>
                   </pic:spPr>
                 </pic:pic>
               </a:graphicData>
@@ -2179,6 +2229,9 @@
             </wp14:sizeRelV>
           </wp:anchor>
         </w:drawing>
+      </w:r>
+      <w:r>
+        <w:t>3. Dependency Vulnerability Report</w:t>
       </w:r>
     </w:p>
     <w:sectPr>

</xml_diff>